<commit_message>
Update the resume and fix a few inconsistencies across the site
Resume (Word source and PDF):
- Hyphenate the phone number and fix NumPy/Bayesian casing
- Use the published Metapipeline-DNA title ("and", not "&")
- Note the RECOMB 2024 presentation on the Genome Research entry
- List the Dean's Honors List range as 2020 - 2024 to match the cv page

Site:
- Drop the space before the comma in proceedings entries, which showed
  up as "Biology , 2024" on the RECOMB presentation
- Shorten the OpenReview link for the ICLR Gen2 workshop paper
- Match the Metapipeline-DNA title in cv.yml and trim a trailing space
  in resume.json
</commit_message>
<xml_diff>
--- a/_resume/Prateek_Anand_Resume_1page.docx
+++ b/_resume/Prateek_Anand_Resume_1page.docx
@@ -15,7 +15,7 @@
         <w:pStyle w:val="Contact"/>
       </w:pPr>
       <w:r>
-        <w:t xml:space="preserve">Los Angeles, CA | (408) 431 1325 | </w:t>
+        <w:t xml:space="preserve">Los Angeles, CA | (408) 431-1325 | </w:t>
       </w:r>
       <w:hyperlink w:history="1" r:id="rIdxrvvtjzzhy7tq30enhw-r">
         <w:r>
@@ -285,7 +285,7 @@
         <w:pStyle w:val="Bullet"/>
       </w:pPr>
       <w:r>
-        <w:t xml:space="preserve">Computational modeling and inference, refined model built using approximate bayesian computation to detect blood cancer early</w:t>
+        <w:t xml:space="preserve">Computational modeling and inference, refined model built using approximate Bayesian computation to detect blood cancer early</w:t>
       </w:r>
     </w:p>
     <w:p>
@@ -374,7 +374,7 @@
         <w:t xml:space="preserve">Prateek Anand</w:t>
       </w:r>
       <w:r>
-        <w:t xml:space="preserve">, ..., Paul C. Boutros. Metapipeline-DNA: A comprehensive germline &amp; somatic genomics Nextflow pipeline, </w:t>
+        <w:t xml:space="preserve">, ..., Paul C. Boutros. Metapipeline-DNA: A comprehensive germline and somatic genomics Nextflow pipeline, </w:t>
       </w:r>
       <w:r>
         <w:rPr>
@@ -440,7 +440,17 @@
         <w:t xml:space="preserve">Genome Research</w:t>
       </w:r>
       <w:r>
-        <w:t xml:space="preserve">, (2024).</w:t>
+        <w:t xml:space="preserve">, (2024). Also presented at </w:t>
+      </w:r>
+      <w:r>
+        <w:rPr>
+          <w:i/>
+          <w:iCs/>
+        </w:rPr>
+        <w:t xml:space="preserve">RECOMB</w:t>
+      </w:r>
+      <w:r>
+        <w:t xml:space="preserve"> (2024).</w:t>
       </w:r>
     </w:p>
     <w:p>
@@ -632,7 +642,7 @@
         <w:t xml:space="preserve">Programming &amp; Tools</w:t>
       </w:r>
       <w:r>
-        <w:t xml:space="preserve">: Python, C++, PyTorch, Scikit-learn, Numpy, Pandas, Git, Cluster Computing</w:t>
+        <w:t xml:space="preserve">: Python, C++, PyTorch, Scikit-learn, NumPy, Pandas, Git, Cluster Computing</w:t>
       </w:r>
     </w:p>
     <w:p>
@@ -735,7 +745,7 @@
         <w:t xml:space="preserve">UCLA Dean's Honors List:</w:t>
       </w:r>
       <w:r>
-        <w:t xml:space="preserve"> 6 quarters (2021 - 2023)</w:t>
+        <w:t xml:space="preserve"> 6 quarters (2020 - 2024)</w:t>
       </w:r>
     </w:p>
     <w:sectPr>

</xml_diff>

<commit_message>
Drop the quarter count from the Dean's Honors List entry
The resume now lists it as "UCLA Dean's Honors List (2020 - 2024)",
matching the cv page.
</commit_message>
<xml_diff>
--- a/_resume/Prateek_Anand_Resume_1page.docx
+++ b/_resume/Prateek_Anand_Resume_1page.docx
@@ -742,10 +742,10 @@
           <w:b/>
           <w:bCs/>
         </w:rPr>
-        <w:t xml:space="preserve">UCLA Dean's Honors List:</w:t>
-      </w:r>
-      <w:r>
-        <w:t xml:space="preserve"> 6 quarters (2020 - 2024)</w:t>
+        <w:t xml:space="preserve">UCLA Dean's Honors List</w:t>
+      </w:r>
+      <w:r>
+        <w:t xml:space="preserve"> (2020 - 2024)</w:t>
       </w:r>
     </w:p>
     <w:sectPr>

</xml_diff>

<commit_message>
Describe the current research directions on the site and resume
- Add the imputation work (ensemble machine learning approaches for
  imputing rare variants across diverse ancestries) to the about page,
  cv, and resume, after the diffusion and GPC work
- Note on the resume and cv that the enhancer-design diffusion paper is
  under review
- Call GPC "recent work" on the resume, since it is no longer the latest
- Add genotype imputation to the site keywords
</commit_message>
<xml_diff>
--- a/_resume/Prateek_Anand_Resume_1page.docx
+++ b/_resume/Prateek_Anand_Resume_1page.docx
@@ -90,7 +90,7 @@
         <w:pStyle w:val="Bullet"/>
       </w:pPr>
       <w:r>
-        <w:t xml:space="preserve">Latest work, GPC (deep generative model for genetic data): </w:t>
+        <w:t xml:space="preserve">Recent work, GPC (deep generative model for genetic data): </w:t>
       </w:r>
       <w:r>
         <w:rPr>
@@ -225,7 +225,7 @@
         <w:pStyle w:val="Bullet"/>
       </w:pPr>
       <w:r>
-        <w:t xml:space="preserve">Developing discrete diffusion models and improved guidance methods for cell-type-specific regulatory DNA design</w:t>
+        <w:t xml:space="preserve">Developing discrete diffusion models and improved guidance methods for cell-type-specific enhancer design (under review)</w:t>
       </w:r>
     </w:p>
     <w:p>
@@ -234,6 +234,14 @@
       </w:pPr>
       <w:r>
         <w:t xml:space="preserve">Building deep generative models of genetic variation for synthetic data and imputation</w:t>
+      </w:r>
+    </w:p>
+    <w:p>
+      <w:pPr>
+        <w:pStyle w:val="Bullet"/>
+      </w:pPr>
+      <w:r>
+        <w:t xml:space="preserve">Developing ensemble machine learning approaches for imputing rare variants across diverse ancestries</w:t>
       </w:r>
     </w:p>
     <w:p>

</xml_diff>

<commit_message>
Add the SUMMIT preprint to the publications page, CV, and resume
</commit_message>
<xml_diff>
--- a/_resume/Prateek_Anand_Resume_1page.docx
+++ b/_resume/Prateek_Anand_Resume_1page.docx
@@ -364,6 +364,69 @@
         <w:t xml:space="preserve">PLOS Genetics</w:t>
       </w:r>
       <w:r>
+        <w:t xml:space="preserve">, (2026). Also a </w:t>
+      </w:r>
+      <w:r>
+        <w:rPr>
+          <w:b/>
+          <w:bCs/>
+        </w:rPr>
+        <w:t xml:space="preserve">Top 10% Oral Spotlight</w:t>
+      </w:r>
+      <w:r>
+        <w:t xml:space="preserve"> at the </w:t>
+      </w:r>
+      <w:r>
+        <w:rPr>
+          <w:i/>
+          <w:iCs/>
+        </w:rPr>
+        <w:t xml:space="preserve">ICLR Gen</w:t>
+      </w:r>
+      <w:r>
+        <w:rPr>
+          <w:i/>
+          <w:iCs/>
+          <w:vertAlign w:val="superscript"/>
+        </w:rPr>
+        <w:t xml:space="preserve">2</w:t>
+      </w:r>
+      <w:r>
+        <w:rPr>
+          <w:i/>
+          <w:iCs/>
+        </w:rPr>
+        <w:t xml:space="preserve"> Workshop</w:t>
+      </w:r>
+      <w:r>
+        <w:t xml:space="preserve"> (2026).</w:t>
+      </w:r>
+    </w:p>
+    <w:p>
+      <w:pPr>
+        <w:pStyle w:val="PubBullet"/>
+      </w:pPr>
+      <w:r>
+        <w:t xml:space="preserve">Yash Patel*, Chenghao Zhu*, Takafumi N. Yamaguchi*, ..., </w:t>
+      </w:r>
+      <w:r>
+        <w:rPr>
+          <w:b/>
+          <w:bCs/>
+        </w:rPr>
+        <w:t xml:space="preserve">Prateek Anand</w:t>
+      </w:r>
+      <w:r>
+        <w:t xml:space="preserve">, ..., Paul C. Boutros. Metapipeline-DNA: A comprehensive germline and somatic genomics Nextflow pipeline, </w:t>
+      </w:r>
+      <w:r>
+        <w:rPr>
+          <w:i/>
+          <w:iCs/>
+        </w:rPr>
+        <w:t xml:space="preserve">Cell Reports Methods</w:t>
+      </w:r>
+      <w:r>
         <w:t xml:space="preserve">, (2026).</w:t>
       </w:r>
     </w:p>
@@ -372,7 +435,7 @@
         <w:pStyle w:val="PubBullet"/>
       </w:pPr>
       <w:r>
-        <w:t xml:space="preserve">Yash Patel*, Chenghao Zhu*, Takafumi N. Yamaguchi*, ..., </w:t>
+        <w:t xml:space="preserve">Boyang Fu*, Ali Pazokitoroudi*, ..., </w:t>
       </w:r>
       <w:r>
         <w:rPr>
@@ -382,138 +445,91 @@
         <w:t xml:space="preserve">Prateek Anand</w:t>
       </w:r>
       <w:r>
-        <w:t xml:space="preserve">, ..., Paul C. Boutros. Metapipeline-DNA: A comprehensive germline and somatic genomics Nextflow pipeline, </w:t>
-      </w:r>
-      <w:r>
-        <w:rPr>
-          <w:i/>
-          <w:iCs/>
-        </w:rPr>
-        <w:t xml:space="preserve">Cell Reports Methods</w:t>
+        <w:t xml:space="preserve">, ..., Sriram Sankararaman. A biobank-scale test of marginal epistasis reveals genome-wide signals of polygenic interaction effects, </w:t>
+      </w:r>
+      <w:r>
+        <w:rPr>
+          <w:i/>
+          <w:iCs/>
+        </w:rPr>
+        <w:t xml:space="preserve">Nature Genetics</w:t>
+      </w:r>
+      <w:r>
+        <w:t xml:space="preserve">, (2025).</w:t>
+      </w:r>
+    </w:p>
+    <w:p>
+      <w:pPr>
+        <w:pStyle w:val="PubBullet"/>
+      </w:pPr>
+      <w:r>
+        <w:t xml:space="preserve">Boyang Fu*, </w:t>
+      </w:r>
+      <w:r>
+        <w:rPr>
+          <w:b/>
+          <w:bCs/>
+        </w:rPr>
+        <w:t xml:space="preserve">Prateek Anand</w:t>
+      </w:r>
+      <w:r>
+        <w:t xml:space="preserve">*, Aakarsh Anand*, Joel Mefford, Sriram Sankararaman. A scalable adaptive quadratic kernel method for interpretable epistasis analysis in complex traits, </w:t>
+      </w:r>
+      <w:r>
+        <w:rPr>
+          <w:i/>
+          <w:iCs/>
+        </w:rPr>
+        <w:t xml:space="preserve">Genome Research</w:t>
+      </w:r>
+      <w:r>
+        <w:t xml:space="preserve">, (2024). Also presented at </w:t>
+      </w:r>
+      <w:r>
+        <w:rPr>
+          <w:i/>
+          <w:iCs/>
+        </w:rPr>
+        <w:t xml:space="preserve">RECOMB</w:t>
+      </w:r>
+      <w:r>
+        <w:t xml:space="preserve"> (2024).</w:t>
+      </w:r>
+    </w:p>
+    <w:p>
+      <w:pPr>
+        <w:pStyle w:val="SectionHeader"/>
+      </w:pPr>
+      <w:r>
+        <w:t xml:space="preserve">PREPRINTS</w:t>
+      </w:r>
+    </w:p>
+    <w:p>
+      <w:pPr>
+        <w:pStyle w:val="PubBullet"/>
+      </w:pPr>
+      <w:r>
+        <w:t xml:space="preserve">Moonseong Jeong, ..., </w:t>
+      </w:r>
+      <w:r>
+        <w:rPr>
+          <w:b/>
+          <w:bCs/>
+        </w:rPr>
+        <w:t xml:space="preserve">Prateek Anand</w:t>
+      </w:r>
+      <w:r>
+        <w:t xml:space="preserve">, ..., Sriram Sankararaman. Genome-wide LD scores enable robust heritability and genetic correlation estimation from summary statistics across genetic ancestries, </w:t>
+      </w:r>
+      <w:r>
+        <w:rPr>
+          <w:i/>
+          <w:iCs/>
+        </w:rPr>
+        <w:t xml:space="preserve">bioRxiv</w:t>
       </w:r>
       <w:r>
         <w:t xml:space="preserve">, (2026).</w:t>
-      </w:r>
-    </w:p>
-    <w:p>
-      <w:pPr>
-        <w:pStyle w:val="PubBullet"/>
-      </w:pPr>
-      <w:r>
-        <w:t xml:space="preserve">Boyang Fu*, Ali Pazokitoroudi*, ..., </w:t>
-      </w:r>
-      <w:r>
-        <w:rPr>
-          <w:b/>
-          <w:bCs/>
-        </w:rPr>
-        <w:t xml:space="preserve">Prateek Anand</w:t>
-      </w:r>
-      <w:r>
-        <w:t xml:space="preserve">, ..., Sriram Sankararaman. A biobank-scale test of marginal epistasis reveals genome-wide signals of polygenic interaction effects, </w:t>
-      </w:r>
-      <w:r>
-        <w:rPr>
-          <w:i/>
-          <w:iCs/>
-        </w:rPr>
-        <w:t xml:space="preserve">Nature Genetics</w:t>
-      </w:r>
-      <w:r>
-        <w:t xml:space="preserve">, (2025).</w:t>
-      </w:r>
-    </w:p>
-    <w:p>
-      <w:pPr>
-        <w:pStyle w:val="PubBullet"/>
-      </w:pPr>
-      <w:r>
-        <w:t xml:space="preserve">Boyang Fu*, </w:t>
-      </w:r>
-      <w:r>
-        <w:rPr>
-          <w:b/>
-          <w:bCs/>
-        </w:rPr>
-        <w:t xml:space="preserve">Prateek Anand</w:t>
-      </w:r>
-      <w:r>
-        <w:t xml:space="preserve">*, Aakarsh Anand*, Joel Mefford, Sriram Sankararaman. A scalable adaptive quadratic kernel method for interpretable epistasis analysis in complex traits, </w:t>
-      </w:r>
-      <w:r>
-        <w:rPr>
-          <w:i/>
-          <w:iCs/>
-        </w:rPr>
-        <w:t xml:space="preserve">Genome Research</w:t>
-      </w:r>
-      <w:r>
-        <w:t xml:space="preserve">, (2024). Also presented at </w:t>
-      </w:r>
-      <w:r>
-        <w:rPr>
-          <w:i/>
-          <w:iCs/>
-        </w:rPr>
-        <w:t xml:space="preserve">RECOMB</w:t>
-      </w:r>
-      <w:r>
-        <w:t xml:space="preserve"> (2024).</w:t>
-      </w:r>
-    </w:p>
-    <w:p>
-      <w:pPr>
-        <w:pStyle w:val="SectionHeader"/>
-      </w:pPr>
-      <w:r>
-        <w:t xml:space="preserve">PREPRINTS</w:t>
-      </w:r>
-    </w:p>
-    <w:p>
-      <w:pPr>
-        <w:pStyle w:val="PubBullet"/>
-      </w:pPr>
-      <w:r>
-        <w:rPr>
-          <w:b/>
-          <w:bCs/>
-        </w:rPr>
-        <w:t xml:space="preserve">Prateek Anand</w:t>
-      </w:r>
-      <w:r>
-        <w:t xml:space="preserve">, ..., Guy Van den Broeck*, Sriram Sankararaman*. GPC: Deep generative model of genetic variation data improves imputation accuracy in private populations, </w:t>
-      </w:r>
-      <w:r>
-        <w:rPr>
-          <w:i/>
-          <w:iCs/>
-        </w:rPr>
-        <w:t xml:space="preserve">ICLR Gen</w:t>
-      </w:r>
-      <w:r>
-        <w:rPr>
-          <w:i/>
-          <w:iCs/>
-          <w:vertAlign w:val="superscript"/>
-        </w:rPr>
-        <w:t xml:space="preserve">2</w:t>
-      </w:r>
-      <w:r>
-        <w:rPr>
-          <w:i/>
-          <w:iCs/>
-        </w:rPr>
-        <w:t xml:space="preserve"> Workshop</w:t>
-      </w:r>
-      <w:r>
-        <w:t xml:space="preserve">, (2026). </w:t>
-      </w:r>
-      <w:r>
-        <w:rPr>
-          <w:b/>
-          <w:bCs/>
-        </w:rPr>
-        <w:t xml:space="preserve">Top 10% Oral Spotlight Presentation.</w:t>
       </w:r>
     </w:p>
     <w:p>

</xml_diff>

<commit_message>
Add the ML4H 2026 paper to the publications page, CV, and resume
List it second among the 2026 publications, after GPC. The title stays
unlinked until the paper is public, and the CV page now shows plain text
for entries without a URL. The ASHG 2025 presentation comes off the
one-page resume to make room; it stays on the website.
</commit_message>
<xml_diff>
--- a/_resume/Prateek_Anand_Resume_1page.docx
+++ b/_resume/Prateek_Anand_Resume_1page.docx
@@ -407,6 +407,34 @@
         <w:pStyle w:val="PubBullet"/>
       </w:pPr>
       <w:r>
+        <w:t xml:space="preserve">Moonseong Jeong, </w:t>
+      </w:r>
+      <w:r>
+        <w:rPr>
+          <w:b/>
+          <w:bCs/>
+        </w:rPr>
+        <w:t xml:space="preserve">Prateek Anand</w:t>
+      </w:r>
+      <w:r>
+        <w:t xml:space="preserve">, ..., Sriram Sankararaman. The Label is Not the Disease: Recognition Delay in Diagnosis Codes and Its Cost to EHR Case Finding, </w:t>
+      </w:r>
+      <w:r>
+        <w:rPr>
+          <w:i/>
+          <w:iCs/>
+        </w:rPr>
+        <w:t xml:space="preserve">Machine Learning for Health (ML4H)</w:t>
+      </w:r>
+      <w:r>
+        <w:t xml:space="preserve">, (2026).</w:t>
+      </w:r>
+    </w:p>
+    <w:p>
+      <w:pPr>
+        <w:pStyle w:val="PubBullet"/>
+      </w:pPr>
+      <w:r>
         <w:t xml:space="preserve">Yash Patel*, Chenghao Zhu*, Takafumi N. Yamaguchi*, ..., </w:t>
       </w:r>
       <w:r>
@@ -555,39 +583,6 @@
           <w:iCs/>
         </w:rPr>
         <w:t xml:space="preserve">bioRxiv</w:t>
-      </w:r>
-      <w:r>
-        <w:t xml:space="preserve">, (2025).</w:t>
-      </w:r>
-    </w:p>
-    <w:p>
-      <w:pPr>
-        <w:pStyle w:val="SectionHeader"/>
-      </w:pPr>
-      <w:r>
-        <w:t xml:space="preserve">PRESENTATIONS</w:t>
-      </w:r>
-    </w:p>
-    <w:p>
-      <w:pPr>
-        <w:pStyle w:val="PubBullet"/>
-      </w:pPr>
-      <w:r>
-        <w:rPr>
-          <w:b/>
-          <w:bCs/>
-        </w:rPr>
-        <w:t xml:space="preserve">Prateek Anand</w:t>
-      </w:r>
-      <w:r>
-        <w:t xml:space="preserve">, ..., Guy Van den Broeck*, Sriram Sankararaman*. Deep generative model of genetic variation data improves imputation accuracy in private populations, </w:t>
-      </w:r>
-      <w:r>
-        <w:rPr>
-          <w:i/>
-          <w:iCs/>
-        </w:rPr>
-        <w:t xml:space="preserve">American Society of Human Genetics</w:t>
       </w:r>
       <w:r>
         <w:t xml:space="preserve">, (2025).</w:t>

</xml_diff>